<commit_message>
Guardar diseño preliminar del menú principal 5
</commit_message>
<xml_diff>
--- a/documentacion/documentacion_Parqueo.docx
+++ b/documentacion/documentacion_Parqueo.docx
@@ -2088,15 +2088,7 @@
     </w:p>
     <w:p>
       <w:r>
-        <w:t xml:space="preserve">Existe una problemática de </w:t>
-      </w:r>
-      <w:proofErr w:type="gramStart"/>
-      <w:r>
-        <w:t>que</w:t>
-      </w:r>
-      <w:proofErr w:type="gramEnd"/>
-      <w:r>
-        <w:t xml:space="preserve"> e</w:t>
+        <w:t>Existe una problemática de que e</w:t>
       </w:r>
       <w:r>
         <w:t>n muchos parqueos, como los de comercios, edificios, instituciones o terrenos privados, el control de los vehículos todavía se hace de forma manual. Se anotan las placas y las horas en un cuaderno o en hojas sueltas, y el cobro se calcula a mano o de memoria. Aunque este método parece sencillo, tiene varias desventajas que afectan tanto a quien administra el parqueo como a quienes lo utilizan.</w:t>
@@ -2151,15 +2143,7 @@
     <w:p>
       <w:r>
         <w:lastRenderedPageBreak/>
-        <w:t xml:space="preserve">Finalmente, el proyecto tiene un valor práctico y de crecimiento a futuro. Aunque en esta etapa se plantea una solución básica, la estructura de la base de datos y la organización del código permiten ampliarla más adelante, por </w:t>
-      </w:r>
-      <w:proofErr w:type="gramStart"/>
-      <w:r>
-        <w:t>ejemplo</w:t>
-      </w:r>
-      <w:proofErr w:type="gramEnd"/>
-      <w:r>
-        <w:t xml:space="preserve"> agregando nuevos tipos de vehículo, reportes de ingresos o un control de usuarios con inicio de sesión. De esta forma, el sistema no solo cumple con los requisitos del curso, sino que también representa una solución real que podría adaptarse a las necesidades de un parqueo pequeño.</w:t>
+        <w:t>Finalmente, el proyecto tiene un valor práctico y de crecimiento a futuro. Aunque en esta etapa se plantea una solución básica, la estructura de la base de datos y la organización del código permiten ampliarla más adelante, por ejemplo agregando nuevos tipos de vehículo, reportes de ingresos o un control de usuarios con inicio de sesión. De esta forma, el sistema no solo cumple con los requisitos del curso, sino que también representa una solución real que podría adaptarse a las necesidades de un parqueo pequeño.</w:t>
       </w:r>
     </w:p>
     <w:p/>
@@ -2600,7 +2584,6 @@
                 <w:rFonts w:ascii="Times New Roman" w:hAnsi="Times New Roman"/>
               </w:rPr>
             </w:pPr>
-            <w:proofErr w:type="gramStart"/>
             <w:r>
               <w:rPr>
                 <w:rFonts w:ascii="Times New Roman" w:hAnsi="Times New Roman"/>
@@ -2619,7 +2602,6 @@
               </w:rPr>
               <w:t>Clientes</w:t>
             </w:r>
-            <w:proofErr w:type="gramEnd"/>
           </w:p>
         </w:tc>
       </w:tr>
@@ -2713,16 +2695,8 @@
               <w:rPr>
                 <w:rFonts w:ascii="Times New Roman" w:hAnsi="Times New Roman"/>
               </w:rPr>
-              <w:t xml:space="preserve"> con los clientes registrados. Se puede buscar por cédula o nombre. Al seleccionar un cliente, sus datos se cargan para editarlos, y para eliminar se pide confirmación. No se permite eliminar a un cliente que tenga vehículos </w:t>
-            </w:r>
-            <w:proofErr w:type="gramStart"/>
-            <w:r>
-              <w:rPr>
-                <w:rFonts w:ascii="Times New Roman" w:hAnsi="Times New Roman"/>
-              </w:rPr>
-              <w:t>asociados..</w:t>
-            </w:r>
-            <w:proofErr w:type="gramEnd"/>
+              <w:t xml:space="preserve"> con los clientes registrados. Se puede buscar por cédula o nombre. Al seleccionar un cliente, sus datos se cargan para editarlos, y para eliminar se pide confirmación. No se permite eliminar a un cliente que tenga vehículos asociados..</w:t>
+            </w:r>
           </w:p>
         </w:tc>
       </w:tr>
@@ -5326,6 +5300,130 @@
         <w:t xml:space="preserve"> y set. Cuando programes las clases, mantén esos mismos nombres para que el diagrama coincida con tu código.</w:t>
       </w:r>
     </w:p>
+    <w:p/>
+    <w:p/>
+    <w:p/>
+    <w:p>
+      <w:pPr>
+        <w:jc w:val="center"/>
+      </w:pPr>
+    </w:p>
+    <w:p>
+      <w:pPr>
+        <w:jc w:val="center"/>
+      </w:pPr>
+    </w:p>
+    <w:p>
+      <w:pPr>
+        <w:rPr>
+          <w:b/>
+          <w:bCs/>
+        </w:rPr>
+      </w:pPr>
+      <w:r>
+        <w:rPr>
+          <w:b/>
+          <w:bCs/>
+        </w:rPr>
+        <w:lastRenderedPageBreak/>
+        <w:t>Figura 4</w:t>
+      </w:r>
+    </w:p>
+    <w:p>
+      <w:r>
+        <w:drawing>
+          <wp:anchor distT="0" distB="0" distL="114300" distR="114300" simplePos="0" relativeHeight="251659264" behindDoc="0" locked="0" layoutInCell="1" allowOverlap="1" wp14:anchorId="12B60C01" wp14:editId="38B56A6C">
+            <wp:simplePos x="0" y="0"/>
+            <wp:positionH relativeFrom="column">
+              <wp:posOffset>-270510</wp:posOffset>
+            </wp:positionH>
+            <wp:positionV relativeFrom="paragraph">
+              <wp:posOffset>328930</wp:posOffset>
+            </wp:positionV>
+            <wp:extent cx="6188075" cy="2476500"/>
+            <wp:effectExtent l="0" t="0" r="3175" b="0"/>
+            <wp:wrapSquare wrapText="bothSides"/>
+            <wp:docPr id="1579664049" name="Imagen 1"/>
+            <wp:cNvGraphicFramePr>
+              <a:graphicFrameLocks xmlns:a="http://schemas.openxmlformats.org/drawingml/2006/main" noChangeAspect="1"/>
+            </wp:cNvGraphicFramePr>
+            <a:graphic xmlns:a="http://schemas.openxmlformats.org/drawingml/2006/main">
+              <a:graphicData uri="http://schemas.openxmlformats.org/drawingml/2006/picture">
+                <pic:pic xmlns:pic="http://schemas.openxmlformats.org/drawingml/2006/picture">
+                  <pic:nvPicPr>
+                    <pic:cNvPr id="1579664049" name=""/>
+                    <pic:cNvPicPr/>
+                  </pic:nvPicPr>
+                  <pic:blipFill>
+                    <a:blip r:embed="rId11">
+                      <a:extLst>
+                        <a:ext uri="{28A0092B-C50C-407E-A947-70E740481C1C}">
+                          <a14:useLocalDpi xmlns:a14="http://schemas.microsoft.com/office/drawing/2010/main" val="0"/>
+                        </a:ext>
+                      </a:extLst>
+                    </a:blip>
+                    <a:stretch>
+                      <a:fillRect/>
+                    </a:stretch>
+                  </pic:blipFill>
+                  <pic:spPr>
+                    <a:xfrm>
+                      <a:off x="0" y="0"/>
+                      <a:ext cx="6188075" cy="2476500"/>
+                    </a:xfrm>
+                    <a:prstGeom prst="rect">
+                      <a:avLst/>
+                    </a:prstGeom>
+                  </pic:spPr>
+                </pic:pic>
+              </a:graphicData>
+            </a:graphic>
+            <wp14:sizeRelH relativeFrom="margin">
+              <wp14:pctWidth>0</wp14:pctWidth>
+            </wp14:sizeRelH>
+            <wp14:sizeRelV relativeFrom="margin">
+              <wp14:pctHeight>0</wp14:pctHeight>
+            </wp14:sizeRelV>
+          </wp:anchor>
+        </w:drawing>
+      </w:r>
+    </w:p>
+    <w:p/>
+    <w:p>
+      <w:pPr>
+        <w:pStyle w:val="Descripcin"/>
+        <w:jc w:val="both"/>
+        <w:rPr>
+          <w:rFonts w:ascii="Times New Roman" w:hAnsi="Times New Roman" w:cs="Times New Roman"/>
+        </w:rPr>
+      </w:pPr>
+      <w:r>
+        <w:rPr>
+          <w:rFonts w:ascii="Times New Roman" w:hAnsi="Times New Roman" w:cs="Times New Roman"/>
+        </w:rPr>
+        <w:t xml:space="preserve">Idea de diseño </w:t>
+      </w:r>
+      <w:r>
+        <w:rPr>
+          <w:rFonts w:ascii="Times New Roman" w:hAnsi="Times New Roman" w:cs="Times New Roman"/>
+        </w:rPr>
+        <w:t>preliminar</w:t>
+      </w:r>
+    </w:p>
+    <w:p>
+      <w:r>
+        <w:t>La siguiente imagen presenta una idea inicial del diseño de la interfaz principal del Sistema de Gestión de Parqueo. Esta propuesta tiene como finalidad mostrar de manera general cómo podría organizarse el menú y distribuirse sus principales opciones. Se trata de un diseño preliminar, por lo que está sujeto a cambios, mejoras y actualizaciones durante el desarrollo del proyecto, de acuerdo con las necesidades identificadas y los ajustes que se consideren necesarios para lograr una interfaz funcional, ordenada y fácil de utilizar.</w:t>
+      </w:r>
+    </w:p>
+    <w:p/>
+    <w:p/>
+    <w:p/>
+    <w:p/>
+    <w:p>
+      <w:r>
+        <w:br w:type="textWrapping" w:clear="all"/>
+      </w:r>
+    </w:p>
     <w:p>
       <w:pPr>
         <w:pStyle w:val="Ttulo1"/>
@@ -5367,7 +5465,7 @@
                     <pic:cNvPicPr/>
                   </pic:nvPicPr>
                   <pic:blipFill>
-                    <a:blip r:embed="rId11"/>
+                    <a:blip r:embed="rId12"/>
                     <a:stretch>
                       <a:fillRect/>
                     </a:stretch>
@@ -5841,13 +5939,8 @@
             <w:tcW w:w="1854" w:type="dxa"/>
           </w:tcPr>
           <w:p>
-            <w:proofErr w:type="gramStart"/>
-            <w:r>
-              <w:t>VARCHAR(</w:t>
-            </w:r>
-            <w:proofErr w:type="gramEnd"/>
-            <w:r>
-              <w:t>15)</w:t>
+            <w:r>
+              <w:t>VARCHAR(15)</w:t>
             </w:r>
           </w:p>
         </w:tc>
@@ -5903,13 +5996,8 @@
             <w:tcW w:w="1854" w:type="dxa"/>
           </w:tcPr>
           <w:p>
-            <w:proofErr w:type="gramStart"/>
-            <w:r>
-              <w:t>VARCHAR(</w:t>
-            </w:r>
-            <w:proofErr w:type="gramEnd"/>
-            <w:r>
-              <w:t>80)</w:t>
+            <w:r>
+              <w:t>VARCHAR(80)</w:t>
             </w:r>
           </w:p>
         </w:tc>
@@ -5961,13 +6049,8 @@
             <w:tcW w:w="1854" w:type="dxa"/>
           </w:tcPr>
           <w:p>
-            <w:proofErr w:type="gramStart"/>
-            <w:r>
-              <w:t>VARCHAR(</w:t>
-            </w:r>
-            <w:proofErr w:type="gramEnd"/>
-            <w:r>
-              <w:t>15)</w:t>
+            <w:r>
+              <w:t>VARCHAR(15)</w:t>
             </w:r>
           </w:p>
         </w:tc>
@@ -5999,6 +6082,7 @@
         </w:tc>
       </w:tr>
     </w:tbl>
+    <w:p/>
     <w:p/>
     <w:p>
       <w:r>
@@ -6232,13 +6316,8 @@
             <w:tcW w:w="1853" w:type="dxa"/>
           </w:tcPr>
           <w:p>
-            <w:proofErr w:type="gramStart"/>
-            <w:r>
-              <w:t>VARCHAR(</w:t>
-            </w:r>
-            <w:proofErr w:type="gramEnd"/>
-            <w:r>
-              <w:t>1</w:t>
+            <w:r>
+              <w:t>VARCHAR(1</w:t>
             </w:r>
             <w:r>
               <w:t>0</w:t>
@@ -6300,11 +6379,9 @@
             <w:tcW w:w="1853" w:type="dxa"/>
           </w:tcPr>
           <w:p>
-            <w:proofErr w:type="gramStart"/>
             <w:r>
               <w:t>VARCHAR(</w:t>
             </w:r>
-            <w:proofErr w:type="gramEnd"/>
             <w:r>
               <w:t>10</w:t>
             </w:r>
@@ -6359,11 +6436,9 @@
             <w:tcW w:w="1853" w:type="dxa"/>
           </w:tcPr>
           <w:p>
-            <w:proofErr w:type="gramStart"/>
             <w:r>
               <w:t>VARCHAR(</w:t>
             </w:r>
-            <w:proofErr w:type="gramEnd"/>
             <w:r>
               <w:t>40</w:t>
             </w:r>
@@ -6418,13 +6493,8 @@
             <w:tcW w:w="1853" w:type="dxa"/>
           </w:tcPr>
           <w:p>
-            <w:proofErr w:type="gramStart"/>
-            <w:r>
-              <w:t>VARCHAR(</w:t>
-            </w:r>
-            <w:proofErr w:type="gramEnd"/>
-            <w:r>
-              <w:t>30)</w:t>
+            <w:r>
+              <w:t>VARCHAR(30)</w:t>
             </w:r>
           </w:p>
         </w:tc>
@@ -6513,7 +6583,6 @@
         </w:tc>
       </w:tr>
     </w:tbl>
-    <w:p/>
     <w:p/>
     <w:p/>
     <w:p/>
@@ -6583,11 +6652,9 @@
             <w:shd w:val="clear" w:color="auto" w:fill="F2CEED" w:themeFill="accent5" w:themeFillTint="33"/>
           </w:tcPr>
           <w:p>
-            <w:proofErr w:type="spellStart"/>
             <w:r>
               <w:t>Campo</w:t>
             </w:r>
-            <w:proofErr w:type="spellEnd"/>
           </w:p>
         </w:tc>
         <w:tc>
@@ -6820,11 +6887,9 @@
             <w:tcW w:w="1853" w:type="dxa"/>
           </w:tcPr>
           <w:p>
-            <w:proofErr w:type="gramStart"/>
             <w:r>
               <w:t>VARCHAR(</w:t>
             </w:r>
-            <w:proofErr w:type="gramEnd"/>
             <w:r>
               <w:t>10</w:t>
             </w:r>
@@ -6879,11 +6944,9 @@
             <w:tcW w:w="1853" w:type="dxa"/>
           </w:tcPr>
           <w:p>
-            <w:proofErr w:type="gramStart"/>
             <w:r>
               <w:t>VARCHAR(</w:t>
             </w:r>
-            <w:proofErr w:type="gramEnd"/>
             <w:r>
               <w:t>12</w:t>
             </w:r>
@@ -7394,13 +7457,8 @@
             <w:tcW w:w="1853" w:type="dxa"/>
           </w:tcPr>
           <w:p>
-            <w:proofErr w:type="gramStart"/>
-            <w:r>
-              <w:t>DECIMAL(</w:t>
-            </w:r>
-            <w:proofErr w:type="gramEnd"/>
-            <w:r>
-              <w:t>10,2)</w:t>
+            <w:r>
+              <w:t>DECIMAL(10,2)</w:t>
             </w:r>
           </w:p>
         </w:tc>
@@ -7453,7 +7511,7 @@
     </w:p>
     <w:p/>
     <w:sectPr>
-      <w:footerReference w:type="default" r:id="rId12"/>
+      <w:footerReference w:type="default" r:id="rId13"/>
       <w:pgSz w:w="12240" w:h="15840"/>
       <w:pgMar w:top="1417" w:right="1701" w:bottom="1417" w:left="1701" w:header="708" w:footer="708" w:gutter="0"/>
       <w:cols w:space="708"/>

</xml_diff>